<commit_message>
Add documented User Management code for Project 4
</commit_message>
<xml_diff>
--- a/week-4/Critical_Thinking_Assn_4.docx
+++ b/week-4/Critical_Thinking_Assn_4.docx
@@ -128,7 +128,46 @@
       </w:r>
     </w:p>
     <w:p/>
-    <w:p/>
+    <w:p>
+      <w:r>
+        <w:lastRenderedPageBreak/>
+        <w:drawing>
+          <wp:inline distT="0" distB="0" distL="0" distR="0" wp14:anchorId="1844CA17" wp14:editId="1D53B1FF">
+            <wp:extent cx="5943600" cy="4690110"/>
+            <wp:effectExtent l="0" t="0" r="0" b="0"/>
+            <wp:docPr id="1401804584" name="Picture 1"/>
+            <wp:cNvGraphicFramePr>
+              <a:graphicFrameLocks xmlns:a="http://schemas.openxmlformats.org/drawingml/2006/main" noChangeAspect="1"/>
+            </wp:cNvGraphicFramePr>
+            <a:graphic xmlns:a="http://schemas.openxmlformats.org/drawingml/2006/main">
+              <a:graphicData uri="http://schemas.openxmlformats.org/drawingml/2006/picture">
+                <pic:pic xmlns:pic="http://schemas.openxmlformats.org/drawingml/2006/picture">
+                  <pic:nvPicPr>
+                    <pic:cNvPr id="1401804584" name=""/>
+                    <pic:cNvPicPr/>
+                  </pic:nvPicPr>
+                  <pic:blipFill>
+                    <a:blip r:embed="rId5"/>
+                    <a:stretch>
+                      <a:fillRect/>
+                    </a:stretch>
+                  </pic:blipFill>
+                  <pic:spPr>
+                    <a:xfrm>
+                      <a:off x="0" y="0"/>
+                      <a:ext cx="5943600" cy="4690110"/>
+                    </a:xfrm>
+                    <a:prstGeom prst="rect">
+                      <a:avLst/>
+                    </a:prstGeom>
+                  </pic:spPr>
+                </pic:pic>
+              </a:graphicData>
+            </a:graphic>
+          </wp:inline>
+        </w:drawing>
+      </w:r>
+    </w:p>
     <w:p/>
     <w:p/>
     <w:p/>
@@ -152,6 +191,8 @@
         <w:t>Git Repository</w:t>
       </w:r>
     </w:p>
+    <w:p/>
+    <w:p/>
     <w:p/>
     <w:p>
       <w:r>
@@ -172,7 +213,7 @@
                     <pic:cNvPicPr/>
                   </pic:nvPicPr>
                   <pic:blipFill>
-                    <a:blip r:embed="rId5"/>
+                    <a:blip r:embed="rId6"/>
                     <a:stretch>
                       <a:fillRect/>
                     </a:stretch>
@@ -181,6 +222,88 @@
                     <a:xfrm>
                       <a:off x="0" y="0"/>
                       <a:ext cx="5943600" cy="4497070"/>
+                    </a:xfrm>
+                    <a:prstGeom prst="rect">
+                      <a:avLst/>
+                    </a:prstGeom>
+                  </pic:spPr>
+                </pic:pic>
+              </a:graphicData>
+            </a:graphic>
+          </wp:inline>
+        </w:drawing>
+      </w:r>
+    </w:p>
+    <w:p/>
+    <w:p>
+      <w:r>
+        <w:lastRenderedPageBreak/>
+        <w:drawing>
+          <wp:inline distT="0" distB="0" distL="0" distR="0" wp14:anchorId="616056B2" wp14:editId="16ECD45E">
+            <wp:extent cx="5943600" cy="4897120"/>
+            <wp:effectExtent l="0" t="0" r="0" b="5080"/>
+            <wp:docPr id="1730631415" name="Picture 1"/>
+            <wp:cNvGraphicFramePr>
+              <a:graphicFrameLocks xmlns:a="http://schemas.openxmlformats.org/drawingml/2006/main" noChangeAspect="1"/>
+            </wp:cNvGraphicFramePr>
+            <a:graphic xmlns:a="http://schemas.openxmlformats.org/drawingml/2006/main">
+              <a:graphicData uri="http://schemas.openxmlformats.org/drawingml/2006/picture">
+                <pic:pic xmlns:pic="http://schemas.openxmlformats.org/drawingml/2006/picture">
+                  <pic:nvPicPr>
+                    <pic:cNvPr id="1730631415" name=""/>
+                    <pic:cNvPicPr/>
+                  </pic:nvPicPr>
+                  <pic:blipFill>
+                    <a:blip r:embed="rId7"/>
+                    <a:stretch>
+                      <a:fillRect/>
+                    </a:stretch>
+                  </pic:blipFill>
+                  <pic:spPr>
+                    <a:xfrm>
+                      <a:off x="0" y="0"/>
+                      <a:ext cx="5943600" cy="4897120"/>
+                    </a:xfrm>
+                    <a:prstGeom prst="rect">
+                      <a:avLst/>
+                    </a:prstGeom>
+                  </pic:spPr>
+                </pic:pic>
+              </a:graphicData>
+            </a:graphic>
+          </wp:inline>
+        </w:drawing>
+      </w:r>
+    </w:p>
+    <w:p/>
+    <w:p>
+      <w:r>
+        <w:lastRenderedPageBreak/>
+        <w:drawing>
+          <wp:inline distT="0" distB="0" distL="0" distR="0" wp14:anchorId="47D0EA5F" wp14:editId="00FECB63">
+            <wp:extent cx="5943600" cy="5035550"/>
+            <wp:effectExtent l="0" t="0" r="0" b="6350"/>
+            <wp:docPr id="1195225971" name="Picture 1"/>
+            <wp:cNvGraphicFramePr>
+              <a:graphicFrameLocks xmlns:a="http://schemas.openxmlformats.org/drawingml/2006/main" noChangeAspect="1"/>
+            </wp:cNvGraphicFramePr>
+            <a:graphic xmlns:a="http://schemas.openxmlformats.org/drawingml/2006/main">
+              <a:graphicData uri="http://schemas.openxmlformats.org/drawingml/2006/picture">
+                <pic:pic xmlns:pic="http://schemas.openxmlformats.org/drawingml/2006/picture">
+                  <pic:nvPicPr>
+                    <pic:cNvPr id="1195225971" name=""/>
+                    <pic:cNvPicPr/>
+                  </pic:nvPicPr>
+                  <pic:blipFill>
+                    <a:blip r:embed="rId8"/>
+                    <a:stretch>
+                      <a:fillRect/>
+                    </a:stretch>
+                  </pic:blipFill>
+                  <pic:spPr>
+                    <a:xfrm>
+                      <a:off x="0" y="0"/>
+                      <a:ext cx="5943600" cy="5035550"/>
                     </a:xfrm>
                     <a:prstGeom prst="rect">
                       <a:avLst/>

</xml_diff>